<commit_message>
docs: add Change Password section to user manual
</commit_message>
<xml_diff>
--- a/Documentation/user-manual.docx
+++ b/Documentation/user-manual.docx
@@ -502,6 +502,64 @@
           <w:sz w:val="18"/>
         </w:rPr>
         <w:t>[ Screenshot: Login page ]</w:t>
+      </w:r>
+    </w:p>
+    <w:p>
+      <w:r>
+        <w:rPr>
+          <w:b/>
+          <w:sz w:val="20"/>
+        </w:rPr>
+        <w:t>ການປ່ຽນລະຫັດຜ່ານດ້ວຍຕົນເອງ</w:t>
+      </w:r>
+    </w:p>
+    <w:p>
+      <w:r>
+        <w:t>ຫຼັງຈາກເຂົ້າລະບົບ, ຜູ້ໃຊ້ສາມາດປ່ຽນລະຫັດຜ່ານຂອງຕົນເອງໄດ້ທີ່:</w:t>
+      </w:r>
+    </w:p>
+    <w:p>
+      <w:r>
+        <w:rPr>
+          <w:rFonts w:ascii="Consolas" w:hAnsi="Consolas"/>
+          <w:color w:val="333333"/>
+          <w:sz w:val="18"/>
+        </w:rPr>
+        <w:t>System &gt; Change Password</w:t>
+      </w:r>
+    </w:p>
+    <w:p>
+      <w:r>
+        <w:t>1. ໃສ່ລະຫັດປະຈຸບັນ (Current Password).</w:t>
+      </w:r>
+    </w:p>
+    <w:p>
+      <w:r>
+        <w:t>2. ໃສ່ລະຫັດໃໝ່ (New Password) ຢ່າງໜ້ອຍ 6 ຕົວອັກສອນ.</w:t>
+      </w:r>
+    </w:p>
+    <w:p>
+      <w:r>
+        <w:t>3. ຢືນຢັນລະຫັດໃໝ່ (Confirm New Password).</w:t>
+      </w:r>
+    </w:p>
+    <w:p>
+      <w:r>
+        <w:t>4. ກົດ Change Password.</w:t>
+      </w:r>
+    </w:p>
+    <w:p>
+      <w:pPr>
+        <w:jc w:val="center"/>
+        <w:pBdr w:top="{http://schemas.openxmlformats.org/wordprocessingml/2006/main}val=&quot;single&quot; {http://schemas.openxmlformats.org/wordprocessingml/2006/main}sz=&quot;4&quot; {http://schemas.openxmlformats.org/wordprocessingml/2006/main}space=&quot;1&quot; {http://schemas.openxmlformats.org/wordprocessingml/2006/main}color=&quot;CCCCCC&quot;"/>
+      </w:pPr>
+      <w:r>
+        <w:rPr>
+          <w:i/>
+          <w:color w:val="999999"/>
+          <w:sz w:val="18"/>
+        </w:rPr>
+        <w:t>[ Screenshot: Change Password form ]</w:t>
       </w:r>
     </w:p>
     <w:p>

</xml_diff>

<commit_message>
docs: add role management section to user-manual.docx (Lao)
Added sections 4.1 (roles/permissions) and 4.2 (concurrent login)
in Lao language. Also backed up original as .docx.bak
</commit_message>
<xml_diff>
--- a/Documentation/user-manual.docx
+++ b/Documentation/user-manual.docx
@@ -2728,6 +2728,128 @@
         <w:t>— End of Document —</w:t>
       </w:r>
     </w:p>
+    <w:p>
+      <w:r>
+        <w:rPr>
+          <w:b/>
+          <w:sz w:val="28"/>
+        </w:rPr>
+        <w:t>4.1 ສິດຜູ້ໃຊ້ (ບົດບາດ / Roles)</w:t>
+      </w:r>
+    </w:p>
+    <w:p>
+      <w:r>
+        <w:rPr>
+          <w:b w:val="0"/>
+          <w:sz w:val="22"/>
+        </w:rPr>
+        <w:t>ລະບົບມີ 5 ບົດບາດທີ່ກໍານົດໄວ້, ແຕ່ລະບົດບາດສາມາດເຂົ້າເຖິງໜ້າຕ່າງໆ ຕາມທີ່ກໍານົດ:</w:t>
+      </w:r>
+    </w:p>
+    <w:p/>
+    <w:p>
+      <w:r>
+        <w:rPr>
+          <w:b w:val="0"/>
+          <w:sz w:val="22"/>
+        </w:rPr>
+        <w:t>• SUPER ADMIN: ເຂົ້າເຖິງທຸກໜ້າ ແລະ ທຸກຟັງຊັນ (ຈັດການລະບົບ, Config ຕ່າງໆ, ນໍາເຂົ້າ, ຄໍານວນ, ລາຍງານ)</w:t>
+      </w:r>
+    </w:p>
+    <w:p>
+      <w:r>
+        <w:rPr>
+          <w:b w:val="0"/>
+          <w:sz w:val="22"/>
+        </w:rPr>
+        <w:t>• ADMIN: ສິດດຽວກັບ SUPER ADMIN ທຸກຢ່າງ</w:t>
+      </w:r>
+    </w:p>
+    <w:p>
+      <w:r>
+        <w:rPr>
+          <w:b w:val="0"/>
+          <w:sz w:val="22"/>
+        </w:rPr>
+        <w:t>• TECH_TEAM_MOF: ສາມາດນໍາເຂົ້າຂໍ້ມູນ, ຄໍານວນ, ເບິ່ງລາຍງານ ແລະ ການຕັ້ງຄ່າຕ່າງໆ ແຕ່ບໍ່ສາມາດຈັດການຜູ້ໃຊ້ ຫຼື ລະບົບ</w:t>
+      </w:r>
+    </w:p>
+    <w:p>
+      <w:r>
+        <w:rPr>
+          <w:b w:val="0"/>
+          <w:sz w:val="22"/>
+        </w:rPr>
+        <w:t>• ACCOUNTING: ສາມາດນໍາເຂົ້າ, ຄໍານວນ ແລະ ເບິ່ງລາຍງານໄດ້</w:t>
+      </w:r>
+    </w:p>
+    <w:p>
+      <w:r>
+        <w:rPr>
+          <w:b w:val="0"/>
+          <w:sz w:val="22"/>
+        </w:rPr>
+        <w:t>• USER: ສາມາດເບິ່ງລາຍງານເທົ່ານັ້ນ</w:t>
+      </w:r>
+    </w:p>
+    <w:p/>
+    <w:p>
+      <w:r>
+        <w:rPr>
+          <w:b/>
+          <w:sz w:val="22"/>
+        </w:rPr>
+        <w:t>ການຕັ້ງຄ່າສິດຜູ້ໃຊ້:</w:t>
+      </w:r>
+    </w:p>
+    <w:p>
+      <w:r>
+        <w:rPr>
+          <w:b w:val="0"/>
+          <w:sz w:val="22"/>
+        </w:rPr>
+        <w:t>System &gt; Role Management ຫຼື ເບິ່ງທີ່ System &gt; Users ເພື່ອກໍານົດບົດບາດໃຫ້ຜູ້ໃຊ້ແຕ່ລະຄົນ.</w:t>
+      </w:r>
+    </w:p>
+    <w:p/>
+    <w:p>
+      <w:r>
+        <w:rPr>
+          <w:b/>
+          <w:sz w:val="28"/>
+        </w:rPr>
+        <w:t>4.2 ການປ້ອງກັນການເຂົ້າຊໍ້າ (Concurrent Login)</w:t>
+      </w:r>
+    </w:p>
+    <w:p>
+      <w:r>
+        <w:rPr>
+          <w:b w:val="0"/>
+          <w:sz w:val="22"/>
+        </w:rPr>
+        <w:t>ຖ້າຜູ້ໃຊ້ຄົນດຽວເຂົ້າລະບົບຈາກຫຼາຍເຄື່ອງ, ເຊດຊັນເກົ່າຈະຖືກຕັດອັດຕະໂນມັດ. ຜູ້ໃຊ້ຈະເຫັນຂໍ້ຄວາມ:</w:t>
+      </w:r>
+    </w:p>
+    <w:p/>
+    <w:p>
+      <w:r>
+        <w:rPr>
+          <w:b w:val="0"/>
+          <w:sz w:val="22"/>
+        </w:rPr>
+        <w:t>"Your session was closed because your account was signed in from another device."</w:t>
+      </w:r>
+    </w:p>
+    <w:p/>
+    <w:p>
+      <w:r>
+        <w:rPr>
+          <w:b w:val="0"/>
+          <w:sz w:val="22"/>
+        </w:rPr>
+        <w:t>ຖ້າເກີດຂຶ້ນ, ພຽງແຕ່ Login ໃໝ່ເທົ່ານັ້ນ.</w:t>
+      </w:r>
+    </w:p>
     <w:sectPr>
       <w:pgSz w:w="12240" w:h="15840"/>
       <w:pgMar w:top="1440" w:right="1800" w:bottom="1440" w:left="1800" w:header="720" w:footer="720" w:gutter="0"/>

</xml_diff>

<commit_message>
docs: add batch deletion restriction to user-manual.docx
- Updated TECH_TEAM_MOF description: cannot delete batch
- Updated ACCOUNTING description: cannot delete batch
- Added note in Batch Management section: only SUPER ADMIN
  and ADMIN can delete batches
- Added separate note in Roles section about delete restriction
</commit_message>
<xml_diff>
--- a/Documentation/user-manual.docx
+++ b/Documentation/user-manual.docx
@@ -1228,7 +1228,7 @@
     </w:p>
     <w:p>
       <w:r>
-        <w:t>ຫມາຍ: ການ Delete Batch ຈະລຶບຂໍ້ມູນທັງໝົດຂອງ Batch ນັ້ນ. ຢືນຢັນກ່ອນລຶບສະເໝີ.</w:t>
+        <w:t>ຫມາຍ: ການ Delete Batch ຈະລຶບຂໍ້ມູນທັງໝົດຂອງ Batch ນັ້ນ. ຢືນຢັນກ່ອນລຶບສະເໝີ.  ສະເພາະ SUPER ADMIN ແລະ ADMIN ເທົ່ານັ້ນທີ່ສາມາດລຶບ Batch ໄດ້.</w:t>
       </w:r>
     </w:p>
     <w:p>
@@ -2767,20 +2767,12 @@
     </w:p>
     <w:p>
       <w:r>
-        <w:rPr>
-          <w:b w:val="0"/>
-          <w:sz w:val="22"/>
-        </w:rPr>
-        <w:t>• TECH_TEAM_MOF: ສາມາດນໍາເຂົ້າຂໍ້ມູນ, ຄໍານວນ, ເບິ່ງລາຍງານ ແລະ ການຕັ້ງຄ່າຕ່າງໆ ແຕ່ບໍ່ສາມາດຈັດການຜູ້ໃຊ້ ຫຼື ລະບົບ</w:t>
+        <w:t>• TECH_TEAM_MOF: ສາມາດນໍາເຂົ້າຂໍ້ມູນ, ຄໍານວນ, ເບິ່ງລາຍງານ ແລະ ການຕັ້ງຄ່າຕ່າງໆ ແຕ່ບໍ່ສາມາດລຶບ Batch, ຈັດການຜູ້ໃຊ້ ຫຼື ລະບົບ</w:t>
       </w:r>
     </w:p>
     <w:p>
       <w:r>
-        <w:rPr>
-          <w:b w:val="0"/>
-          <w:sz w:val="22"/>
-        </w:rPr>
-        <w:t>• ACCOUNTING: ສາມາດນໍາເຂົ້າ, ຄໍານວນ ແລະ ເບິ່ງລາຍງານໄດ້</w:t>
+        <w:t>• ACCOUNTING: ສາມາດນໍາເຂົ້າ, ຄໍານວນ ແລະ ເບິ່ງລາຍງານໄດ້ ແຕ່ບໍ່ສາມາດລຶບ Batch</w:t>
       </w:r>
     </w:p>
     <w:p>
@@ -2848,6 +2840,17 @@
           <w:sz w:val="22"/>
         </w:rPr>
         <w:t>ຖ້າເກີດຂຶ້ນ, ພຽງແຕ່ Login ໃໝ່ເທົ່ານັ້ນ.</w:t>
+      </w:r>
+    </w:p>
+    <w:p>
+      <w:pPr/>
+    </w:p>
+    <w:p>
+      <w:r>
+        <w:rPr>
+          <w:sz w:val="22"/>
+        </w:rPr>
+        <w:t>ການລຶບ Batch: ສະເພາະ SUPER ADMIN ແລະ ADMIN ເທົ່ານັ້ນທີ່ສາມາດລຶບ Batch ໄດ້. ຜູ້ໃຊ້ອື່ນ (TECH_TEAM_MOF, ACCOUNTING, USER) ຈະບໍ່ເຫັນປຸ່ມ Delete ໃນ Batch Management.</w:t>
       </w:r>
     </w:p>
     <w:sectPr>

</xml_diff>

<commit_message>
docs: add duplicate prevention section 19 in blue text
New section 19 (in blue) explaining:
- How duplicate prevention works before import
- What the user sees when duplicates are found
- How to fix duplicates (delete batch or clean Excel)
- List of all 8 import types with the check applied
</commit_message>
<xml_diff>
--- a/Documentation/user-manual.docx
+++ b/Documentation/user-manual.docx
@@ -2853,6 +2853,165 @@
         <w:t>ການລຶບ Batch: ສະເພາະ SUPER ADMIN ແລະ ADMIN ເທົ່ານັ້ນທີ່ສາມາດລຶບ Batch ໄດ້. ຜູ້ໃຊ້ອື່ນ (TECH_TEAM_MOF, ACCOUNTING, USER) ຈະບໍ່ເຫັນປຸ່ມ Delete ໃນ Batch Management.</w:t>
       </w:r>
     </w:p>
+    <w:p>
+      <w:r>
+        <w:rPr>
+          <w:b/>
+          <w:color w:val="0070C0"/>
+          <w:sz w:val="28"/>
+        </w:rPr>
+        <w:t>19. ການປ້ອງກັນຂໍ້ມູນຊໍ້າກ່ອນນໍາເຂົ້າ (Duplicate Prevention)</w:t>
+      </w:r>
+    </w:p>
+    <w:p/>
+    <w:p>
+      <w:r>
+        <w:rPr>
+          <w:color w:val="0070C0"/>
+          <w:sz w:val="22"/>
+        </w:rPr>
+        <w:t>ລະບົບຈະກວດສອບຂໍ້ມູນຊໍ້າກ່ອນການນໍາເຂົ້າທຸກຄັ້ງ ເພື່ອປ້ອງກັນການນໍາເຂົ້າຂໍ້ມູນຊໍ້າກັນ ເຊິ່ງຈະເຮັດໃຫ້ຄ່າ TE ຜິດພາດ. ການກວດສອບນີ້ໃຊ້ໄດ້ກັບທຸກປະເພດການນໍາເຂົ້າທີ່ສໍາຄັນ.</w:t>
+      </w:r>
+    </w:p>
+    <w:p/>
+    <w:p>
+      <w:r>
+        <w:rPr>
+          <w:b/>
+          <w:color w:val="0070C0"/>
+          <w:sz w:val="22"/>
+        </w:rPr>
+        <w:t>ຫຼັກການເຮັດວຽກ:</w:t>
+      </w:r>
+    </w:p>
+    <w:p>
+      <w:r>
+        <w:rPr>
+          <w:color w:val="0070C0"/>
+          <w:sz w:val="22"/>
+        </w:rPr>
+        <w:t>• ກ່ອນການນໍາເຂົ້າ, ລະບົບຈະສະແກນຂໍ້ມູນທັງໝົດໃນ Excel ແລະ ກວດສອບກັບຖານຂໍ້ມູນວ່າມີ TIN + Tax Year ດຽວກັນແລ້ວຫຼືບໍ່.</w:t>
+      </w:r>
+    </w:p>
+    <w:p>
+      <w:r>
+        <w:rPr>
+          <w:color w:val="0070C0"/>
+          <w:sz w:val="22"/>
+        </w:rPr>
+        <w:t>• ຖ້າພົບຂໍ້ມູນຊໍ້າ: ລະບົບຈະສະກັດການນໍາເຂົ້າ ແລະ ສະແດງລາຍງານວ່າມີຈັກລາຍການທີ່ຊໍ້າ, ຢູ່ Batch ໃດ.</w:t>
+      </w:r>
+    </w:p>
+    <w:p>
+      <w:r>
+        <w:rPr>
+          <w:color w:val="0070C0"/>
+          <w:sz w:val="22"/>
+        </w:rPr>
+        <w:t>• ຜູ້ໃຊ້ສາມາດ Download Duplicate Report (CSV) ເພື່ອເບິ່ງລາຍລະອຽດ.</w:t>
+      </w:r>
+    </w:p>
+    <w:p>
+      <w:r>
+        <w:rPr>
+          <w:color w:val="0070C0"/>
+          <w:sz w:val="22"/>
+        </w:rPr>
+        <w:t>• ວິທີແກ້ໄຂ: (1) ລຶບ Batch ເກົ່າອອກກ່ອນ (ສະເພາະ Admin), ຫຼື (2) ລຶບລາຍການທີ່ຊໍ້າອອກຈາກ Excel ແລະ ນໍາເຂົ້າໃໝ່.</w:t>
+      </w:r>
+    </w:p>
+    <w:p>
+      <w:r>
+        <w:rPr>
+          <w:color w:val="0070C0"/>
+          <w:sz w:val="22"/>
+        </w:rPr>
+        <w:t>• ຖ້າບໍ່ມີຂໍ້ມູນຊໍ້າ: ການນໍາເຂົ້າຈະດໍາເນີນການຕາມປົກກະຕິ.</w:t>
+      </w:r>
+    </w:p>
+    <w:p/>
+    <w:p>
+      <w:r>
+        <w:rPr>
+          <w:b/>
+          <w:color w:val="0070C0"/>
+          <w:sz w:val="22"/>
+        </w:rPr>
+        <w:t>ປະເພດການນໍາເຂົ້າທີ່ມີການກວດສອບນີ້:</w:t>
+      </w:r>
+    </w:p>
+    <w:p>
+      <w:r>
+        <w:rPr>
+          <w:color w:val="0070C0"/>
+          <w:sz w:val="22"/>
+        </w:rPr>
+        <w:t>• Profit Tax (CIT) — ກວດສອບ TIN + Tax Year</w:t>
+      </w:r>
+    </w:p>
+    <w:p>
+      <w:r>
+        <w:rPr>
+          <w:color w:val="0070C0"/>
+          <w:sz w:val="22"/>
+        </w:rPr>
+        <w:t>• Domestic VAT — ກວດສອບ TIN + Filing Period</w:t>
+      </w:r>
+    </w:p>
+    <w:p>
+      <w:r>
+        <w:rPr>
+          <w:color w:val="0070C0"/>
+          <w:sz w:val="22"/>
+        </w:rPr>
+        <w:t>• Individual Tax (PIT) — ກວດສອບ PTIN + Tax Year</w:t>
+      </w:r>
+    </w:p>
+    <w:p>
+      <w:r>
+        <w:rPr>
+          <w:color w:val="0070C0"/>
+          <w:sz w:val="22"/>
+        </w:rPr>
+        <w:t>• Salary Tax — ກວດສອບ TIN + Tax Year</w:t>
+      </w:r>
+    </w:p>
+    <w:p>
+      <w:r>
+        <w:rPr>
+          <w:color w:val="0070C0"/>
+          <w:sz w:val="22"/>
+        </w:rPr>
+        <w:t>• SEZ Developer / Investor — ກວດສອບ TIN + Tax Year</w:t>
+      </w:r>
+    </w:p>
+    <w:p>
+      <w:r>
+        <w:rPr>
+          <w:color w:val="0070C0"/>
+          <w:sz w:val="22"/>
+        </w:rPr>
+        <w:t>• Resource Fee — ກວດສອບ TIN + Tax Year</w:t>
+      </w:r>
+    </w:p>
+    <w:p>
+      <w:r>
+        <w:rPr>
+          <w:color w:val="0070C0"/>
+          <w:sz w:val="22"/>
+        </w:rPr>
+        <w:t>• Royalty Fee — ກວດສອບ TIN + Tax Year</w:t>
+      </w:r>
+    </w:p>
+    <w:p>
+      <w:r>
+        <w:rPr>
+          <w:color w:val="0070C0"/>
+          <w:sz w:val="22"/>
+        </w:rPr>
+        <w:t>• Land Concession — ກວດສອບ TIN</w:t>
+      </w:r>
+    </w:p>
     <w:sectPr>
       <w:pgSz w:w="12240" w:h="15840"/>
       <w:pgMar w:top="1440" w:right="1800" w:bottom="1440" w:left="1800" w:header="720" w:footer="720" w:gutter="0"/>

</xml_diff>

<commit_message>
docs: complete plan doc + user manual section 20 on date-based benchmarks
- Updated plan status to Complete
- Fixed technical design section title to Salary Tax
- Added section 20 (blue text) explaining date effectiveness:
  - Which tax types use dates vs years
  - Example: July 1 2024 mid-year rate change
  - Legal justification for year-based types
</commit_message>
<xml_diff>
--- a/Documentation/user-manual.docx
+++ b/Documentation/user-manual.docx
@@ -3012,6 +3012,140 @@
         <w:t>• Land Concession — ກວດສອບ TIN</w:t>
       </w:r>
     </w:p>
+    <w:p>
+      <w:r>
+        <w:rPr>
+          <w:b/>
+          <w:color w:val="0070C0"/>
+          <w:sz w:val="28"/>
+        </w:rPr>
+        <w:t>20. ການກຳນົດວັນທີ່ມີຜົນບັງຄັບໃຊ້ຂອງ Benchmark (Effectiveness by Date)</w:t>
+      </w:r>
+    </w:p>
+    <w:p/>
+    <w:p>
+      <w:r>
+        <w:rPr>
+          <w:b/>
+          <w:color w:val="0070C0"/>
+          <w:sz w:val="22"/>
+        </w:rPr>
+        <w:t>ພາບລວມ:</w:t>
+      </w:r>
+    </w:p>
+    <w:p>
+      <w:r>
+        <w:rPr>
+          <w:b w:val="0"/>
+          <w:color w:val="0070C0"/>
+          <w:sz w:val="22"/>
+        </w:rPr>
+        <w:t>ລະບົບຮອງຮັບການກຳນົດວັນທີ່ມີຜົນບັງຄັບໃຊ້ຂອງ Benchmark (start_date / end_date) ແທນທີ່ຈະໃຊ້ປີ (start_year / end_year). ນີ້ຈະຊ່ວຍໃຫ້ສາມາດກຳນົດອັດຕາ Benchmark ທີ່ປ່ຽນແປງພາຍໃນປີໄດ້ (ເຊັ່ນ ອັດຕາໃໝ່ມີຜົນຕັ້ງແຕ່ວັນທີ 1 ກໍລະກົດ 2024).</w:t>
+      </w:r>
+    </w:p>
+    <w:p/>
+    <w:p>
+      <w:r>
+        <w:rPr>
+          <w:b/>
+          <w:color w:val="0070C0"/>
+          <w:sz w:val="22"/>
+        </w:rPr>
+        <w:t>ປະເພດພາສີທີ່ຮອງຮັບ:</w:t>
+      </w:r>
+    </w:p>
+    <w:p>
+      <w:r>
+        <w:rPr>
+          <w:b w:val="0"/>
+          <w:color w:val="0070C0"/>
+          <w:sz w:val="22"/>
+        </w:rPr>
+        <w:t>• Salary Tax — ໃຊ້ start_date / end_date ໃນ bm_salary_rates</w:t>
+      </w:r>
+    </w:p>
+    <w:p>
+      <w:r>
+        <w:rPr>
+          <w:b w:val="0"/>
+          <w:color w:val="0070C0"/>
+          <w:sz w:val="22"/>
+        </w:rPr>
+        <w:t>• VAT — ໃຊ້ start_date / end_date ໃນ bm_vat (ມີຢູ່ແລ້ວ)</w:t>
+      </w:r>
+    </w:p>
+    <w:p>
+      <w:r>
+        <w:rPr>
+          <w:b w:val="0"/>
+          <w:color w:val="0070C0"/>
+          <w:sz w:val="22"/>
+        </w:rPr>
+        <w:t>• MSME, Customs Regime, Payment Condition — ໃຊ້ effective_date_from / effective_date_to (ມີຢູ່ແລ້ວ)</w:t>
+      </w:r>
+    </w:p>
+    <w:p>
+      <w:r>
+        <w:rPr>
+          <w:b w:val="0"/>
+          <w:color w:val="0070C0"/>
+          <w:sz w:val="22"/>
+        </w:rPr>
+        <w:t>• Customs/Excise — ໃຊ້ຂໍ້ມູນຕາມແຖວໃນ Excel import ໂດຍກົງ (ມີຢູ່ແລ້ວ)</w:t>
+      </w:r>
+    </w:p>
+    <w:p/>
+    <w:p>
+      <w:r>
+        <w:rPr>
+          <w:b/>
+          <w:color w:val="0070C0"/>
+          <w:sz w:val="22"/>
+        </w:rPr>
+        <w:t>ປະເພດພາສີທີ່ໃຊ້ປີ:</w:t>
+      </w:r>
+    </w:p>
+    <w:p>
+      <w:r>
+        <w:rPr>
+          <w:b w:val="0"/>
+          <w:color w:val="0070C0"/>
+          <w:sz w:val="22"/>
+        </w:rPr>
+        <w:t>• CIT, PIT, SEZ, Land Concession — ການຍື່ນແບບລາຍປີ, ການໃຊ້ປີແມ່ນຖືກຕ້ອງຕາມກົດໝາຍ</w:t>
+      </w:r>
+    </w:p>
+    <w:p/>
+    <w:p>
+      <w:r>
+        <w:rPr>
+          <w:b/>
+          <w:color w:val="0070C0"/>
+          <w:sz w:val="22"/>
+        </w:rPr>
+        <w:t>ຕົວຢ່າງ:</w:t>
+      </w:r>
+    </w:p>
+    <w:p>
+      <w:r>
+        <w:rPr>
+          <w:b w:val="0"/>
+          <w:color w:val="0070C0"/>
+          <w:sz w:val="22"/>
+        </w:rPr>
+        <w:t>• ອັດຕາ T21 ສຳລັບປີ 2024: ວັນທີເລີ່ມ 2024-01-01, ວັນທີສິ້ນສຸດ 2024-12-31</w:t>
+      </w:r>
+    </w:p>
+    <w:p>
+      <w:r>
+        <w:rPr>
+          <w:b w:val="0"/>
+          <w:color w:val="0070C0"/>
+          <w:sz w:val="22"/>
+        </w:rPr>
+        <w:t>• ຖ້າມີການປ່ຽນແປງກາງປີ: ວັນທີເລີ່ມ 2024-07-01, ວັນທີສິ້ນສຸດ 2024-12-31</w:t>
+      </w:r>
+    </w:p>
     <w:sectPr>
       <w:pgSz w:w="12240" w:h="15840"/>
       <w:pgMar w:top="1440" w:right="1800" w:bottom="1440" w:left="1800" w:header="720" w:footer="720" w:gutter="0"/>

</xml_diff>